<commit_message>
Update Beta3 user manual and troubleshooting
</commit_message>
<xml_diff>
--- a/docs/AI_PRONOTE_v1.5_사용설명서.docx
+++ b/docs/AI_PRONOTE_v1.5_사용설명서.docx
@@ -2858,6 +2858,145 @@
     <w:p>
       <w:pPr>
         <w:keepNext/>
+        <w:spacing w:before="160" w:after="80"/>
+      </w:pPr>
+      <w:r>
+        <w:rPr>
+          <w:rFonts w:ascii="Pretendard" w:hAnsi="Pretendard" w:eastAsia="Pretendard"/>
+          <w:b/>
+          <w:color w:val="111111"/>
+          <w:sz w:val="23"/>
+        </w:rPr>
+        <w:t>회의가 다시 이어질 때</w:t>
+      </w:r>
+    </w:p>
+    <w:p>
+      <w:pPr>
+        <w:spacing w:after="100" w:line="324" w:lineRule="auto"/>
+      </w:pPr>
+      <w:r>
+        <w:rPr>
+          <w:rFonts w:ascii="Pretendard" w:hAnsi="Pretendard" w:eastAsia="Pretendard"/>
+          <w:b w:val="0"/>
+          <w:color w:val="242424"/>
+          <w:sz w:val="20"/>
+        </w:rPr>
+        <w:t>회의를 끝낸 뒤 받아쓰기나 AI 회의록이 생성되는 중에도 새 녹음을 시작할 수 있습니다.</w:t>
+      </w:r>
+    </w:p>
+    <w:p>
+      <w:pPr>
+        <w:spacing w:after="60" w:line="300" w:lineRule="auto"/>
+        <w:ind w:left="288" w:hanging="288"/>
+      </w:pPr>
+      <w:r>
+        <w:rPr>
+          <w:rFonts w:ascii="Pretendard" w:hAnsi="Pretendard" w:eastAsia="Pretendard"/>
+          <w:b/>
+          <w:color w:val="111111"/>
+          <w:sz w:val="19"/>
+        </w:rPr>
+        <w:t xml:space="preserve">1. </w:t>
+      </w:r>
+      <w:r>
+        <w:rPr>
+          <w:rFonts w:ascii="Pretendard" w:hAnsi="Pretendard" w:eastAsia="Pretendard"/>
+          <w:b w:val="0"/>
+          <w:color w:val="242424"/>
+          <w:sz w:val="19"/>
+        </w:rPr>
+        <w:t>결과 화면 위쪽의 `회의 이어 녹음`을 누릅니다.</w:t>
+      </w:r>
+    </w:p>
+    <w:p>
+      <w:pPr>
+        <w:spacing w:after="60" w:line="300" w:lineRule="auto"/>
+        <w:ind w:left="288" w:hanging="288"/>
+      </w:pPr>
+      <w:r>
+        <w:rPr>
+          <w:rFonts w:ascii="Pretendard" w:hAnsi="Pretendard" w:eastAsia="Pretendard"/>
+          <w:b/>
+          <w:color w:val="111111"/>
+          <w:sz w:val="19"/>
+        </w:rPr>
+        <w:t xml:space="preserve">2. </w:t>
+      </w:r>
+      <w:r>
+        <w:rPr>
+          <w:rFonts w:ascii="Pretendard" w:hAnsi="Pretendard" w:eastAsia="Pretendard"/>
+          <w:b w:val="0"/>
+          <w:color w:val="242424"/>
+          <w:sz w:val="19"/>
+        </w:rPr>
+        <w:t>이전 회의 제목 뒤에 `· 이어서`가 붙었는지 확인합니다.</w:t>
+      </w:r>
+    </w:p>
+    <w:p>
+      <w:pPr>
+        <w:spacing w:after="60" w:line="300" w:lineRule="auto"/>
+        <w:ind w:left="288" w:hanging="288"/>
+      </w:pPr>
+      <w:r>
+        <w:rPr>
+          <w:rFonts w:ascii="Pretendard" w:hAnsi="Pretendard" w:eastAsia="Pretendard"/>
+          <w:b/>
+          <w:color w:val="111111"/>
+          <w:sz w:val="19"/>
+        </w:rPr>
+        <w:t xml:space="preserve">3. </w:t>
+      </w:r>
+      <w:r>
+        <w:rPr>
+          <w:rFonts w:ascii="Pretendard" w:hAnsi="Pretendard" w:eastAsia="Pretendard"/>
+          <w:b w:val="0"/>
+          <w:color w:val="242424"/>
+          <w:sz w:val="19"/>
+        </w:rPr>
+        <w:t>음성 또는 카메라 영상 옵션을 확인하고 녹음을 시작합니다.</w:t>
+      </w:r>
+    </w:p>
+    <w:p>
+      <w:pPr>
+        <w:spacing w:after="60" w:line="300" w:lineRule="auto"/>
+        <w:ind w:left="288" w:hanging="288"/>
+      </w:pPr>
+      <w:r>
+        <w:rPr>
+          <w:rFonts w:ascii="Pretendard" w:hAnsi="Pretendard" w:eastAsia="Pretendard"/>
+          <w:b/>
+          <w:color w:val="111111"/>
+          <w:sz w:val="19"/>
+        </w:rPr>
+        <w:t xml:space="preserve">4. </w:t>
+      </w:r>
+      <w:r>
+        <w:rPr>
+          <w:rFonts w:ascii="Pretendard" w:hAnsi="Pretendard" w:eastAsia="Pretendard"/>
+          <w:b w:val="0"/>
+          <w:color w:val="242424"/>
+          <w:sz w:val="19"/>
+        </w:rPr>
+        <w:t>먼저 끝낸 구간의 처리는 `작업함`에서 계속됩니다.</w:t>
+      </w:r>
+    </w:p>
+    <w:p>
+      <w:pPr>
+        <w:spacing w:after="100" w:line="324" w:lineRule="auto"/>
+      </w:pPr>
+      <w:r>
+        <w:rPr>
+          <w:rFonts w:ascii="Pretendard" w:hAnsi="Pretendard" w:eastAsia="Pretendard"/>
+          <w:b w:val="0"/>
+          <w:color w:val="242424"/>
+          <w:sz w:val="20"/>
+        </w:rPr>
+        <w:t>현재 Beta3에서는 이어진 구간이 별도 기록으로 안전하게 저장됩니다. 두 구간이 자동으로 하나의 회의록에 합쳐지지는 않으므로, 최종 공유 전 두 결과를 모두 확인하세요.</w:t>
+      </w:r>
+    </w:p>
+    <w:p>
+      <w:pPr>
+        <w:keepNext/>
         <w:spacing w:before="240" w:after="140"/>
         <w:pBdr>
           <w:bottom w:val="single" w:sz="6" w:color="E3E3E3" w:space="5"/>
@@ -2872,6 +3011,942 @@
         </w:rPr>
         <w:t>10. 문제 해결</w:t>
       </w:r>
+    </w:p>
+    <w:p>
+      <w:pPr>
+        <w:keepNext/>
+        <w:spacing w:before="160" w:after="80"/>
+      </w:pPr>
+      <w:r>
+        <w:rPr>
+          <w:rFonts w:ascii="Pretendard" w:hAnsi="Pretendard" w:eastAsia="Pretendard"/>
+          <w:b/>
+          <w:color w:val="111111"/>
+          <w:sz w:val="23"/>
+        </w:rPr>
+        <w:t>빠른 진단표</w:t>
+      </w:r>
+    </w:p>
+    <w:tbl>
+      <w:tblPr>
+        <w:tblW w:type="auto" w:w="0"/>
+        <w:jc w:val="center"/>
+        <w:tblLayout w:type="autofit"/>
+        <w:tblLook w:firstColumn="1" w:firstRow="1" w:lastColumn="0" w:lastRow="0" w:noHBand="0" w:noVBand="1" w:val="04A0"/>
+      </w:tblPr>
+      <w:tblGrid>
+        <w:gridCol w:w="2358"/>
+        <w:gridCol w:w="2358"/>
+        <w:gridCol w:w="2358"/>
+        <w:gridCol w:w="2358"/>
+      </w:tblGrid>
+      <w:tr>
+        <w:tc>
+          <w:tcPr>
+            <w:tcW w:type="dxa" w:w="2358"/>
+            <w:vAlign w:val="center"/>
+            <w:shd w:fill="111111"/>
+            <w:tcBorders>
+              <w:top w:val="single" w:sz="8" w:color="111111"/>
+              <w:bottom w:val="single" w:sz="2" w:color="E3E3E3"/>
+            </w:tcBorders>
+          </w:tcPr>
+          <w:p>
+            <w:pPr>
+              <w:spacing w:after="40"/>
+            </w:pPr>
+            <w:r>
+              <w:rPr>
+                <w:rFonts w:ascii="Pretendard" w:hAnsi="Pretendard" w:eastAsia="Pretendard"/>
+                <w:b/>
+                <w:color w:val="FFFFFF"/>
+                <w:sz w:val="17"/>
+              </w:rPr>
+              <w:t>증상</w:t>
+            </w:r>
+          </w:p>
+        </w:tc>
+        <w:tc>
+          <w:tcPr>
+            <w:tcW w:type="dxa" w:w="2358"/>
+            <w:vAlign w:val="center"/>
+            <w:shd w:fill="111111"/>
+            <w:tcBorders>
+              <w:top w:val="single" w:sz="8" w:color="111111"/>
+              <w:bottom w:val="single" w:sz="2" w:color="E3E3E3"/>
+            </w:tcBorders>
+          </w:tcPr>
+          <w:p>
+            <w:pPr>
+              <w:spacing w:after="40"/>
+            </w:pPr>
+            <w:r>
+              <w:rPr>
+                <w:rFonts w:ascii="Pretendard" w:hAnsi="Pretendard" w:eastAsia="Pretendard"/>
+                <w:b/>
+                <w:color w:val="FFFFFF"/>
+                <w:sz w:val="17"/>
+              </w:rPr>
+              <w:t>먼저 확인할 것</w:t>
+            </w:r>
+          </w:p>
+        </w:tc>
+        <w:tc>
+          <w:tcPr>
+            <w:tcW w:type="dxa" w:w="2358"/>
+            <w:vAlign w:val="center"/>
+            <w:shd w:fill="111111"/>
+            <w:tcBorders>
+              <w:top w:val="single" w:sz="8" w:color="111111"/>
+              <w:bottom w:val="single" w:sz="2" w:color="E3E3E3"/>
+            </w:tcBorders>
+          </w:tcPr>
+          <w:p>
+            <w:pPr>
+              <w:spacing w:after="40"/>
+            </w:pPr>
+            <w:r>
+              <w:rPr>
+                <w:rFonts w:ascii="Pretendard" w:hAnsi="Pretendard" w:eastAsia="Pretendard"/>
+                <w:b/>
+                <w:color w:val="FFFFFF"/>
+                <w:sz w:val="17"/>
+              </w:rPr>
+              <w:t>데이터 상태</w:t>
+            </w:r>
+          </w:p>
+        </w:tc>
+        <w:tc>
+          <w:tcPr>
+            <w:tcW w:type="dxa" w:w="2358"/>
+            <w:vAlign w:val="center"/>
+            <w:shd w:fill="111111"/>
+            <w:tcBorders>
+              <w:top w:val="single" w:sz="8" w:color="111111"/>
+              <w:bottom w:val="single" w:sz="2" w:color="E3E3E3"/>
+            </w:tcBorders>
+          </w:tcPr>
+          <w:p>
+            <w:pPr>
+              <w:spacing w:after="40"/>
+            </w:pPr>
+            <w:r>
+              <w:rPr>
+                <w:rFonts w:ascii="Pretendard" w:hAnsi="Pretendard" w:eastAsia="Pretendard"/>
+                <w:b/>
+                <w:color w:val="FFFFFF"/>
+                <w:sz w:val="17"/>
+              </w:rPr>
+              <w:t>다음 행동</w:t>
+            </w:r>
+          </w:p>
+        </w:tc>
+      </w:tr>
+      <w:tr>
+        <w:tc>
+          <w:tcPr>
+            <w:tcW w:type="dxa" w:w="2358"/>
+            <w:vAlign w:val="center"/>
+            <w:tcBorders>
+              <w:top w:val="single" w:sz="2" w:color="E3E3E3"/>
+              <w:bottom w:val="single" w:sz="2" w:color="E3E3E3"/>
+            </w:tcBorders>
+          </w:tcPr>
+          <w:p>
+            <w:pPr>
+              <w:spacing w:after="40"/>
+            </w:pPr>
+            <w:r>
+              <w:rPr>
+                <w:rFonts w:ascii="Pretendard" w:hAnsi="Pretendard" w:eastAsia="Pretendard"/>
+                <w:b w:val="0"/>
+                <w:color w:val="242424"/>
+                <w:sz w:val="17"/>
+              </w:rPr>
+              <w:t>녹음 시작이 계속 대기</w:t>
+            </w:r>
+          </w:p>
+        </w:tc>
+        <w:tc>
+          <w:tcPr>
+            <w:tcW w:type="dxa" w:w="2358"/>
+            <w:vAlign w:val="center"/>
+            <w:tcBorders>
+              <w:top w:val="single" w:sz="2" w:color="E3E3E3"/>
+              <w:bottom w:val="single" w:sz="2" w:color="E3E3E3"/>
+            </w:tcBorders>
+          </w:tcPr>
+          <w:p>
+            <w:pPr>
+              <w:spacing w:after="40"/>
+            </w:pPr>
+            <w:r>
+              <w:rPr>
+                <w:rFonts w:ascii="Pretendard" w:hAnsi="Pretendard" w:eastAsia="Pretendard"/>
+                <w:b w:val="0"/>
+                <w:color w:val="242424"/>
+                <w:sz w:val="17"/>
+              </w:rPr>
+              <w:t>브라우저 주소창과 OS의 마이크·카메라 권한</w:t>
+            </w:r>
+          </w:p>
+        </w:tc>
+        <w:tc>
+          <w:tcPr>
+            <w:tcW w:type="dxa" w:w="2358"/>
+            <w:vAlign w:val="center"/>
+            <w:tcBorders>
+              <w:top w:val="single" w:sz="2" w:color="E3E3E3"/>
+              <w:bottom w:val="single" w:sz="2" w:color="E3E3E3"/>
+            </w:tcBorders>
+          </w:tcPr>
+          <w:p>
+            <w:pPr>
+              <w:spacing w:after="40"/>
+            </w:pPr>
+            <w:r>
+              <w:rPr>
+                <w:rFonts w:ascii="Pretendard" w:hAnsi="Pretendard" w:eastAsia="Pretendard"/>
+                <w:b w:val="0"/>
+                <w:color w:val="242424"/>
+                <w:sz w:val="17"/>
+              </w:rPr>
+              <w:t>시작 전이면 원본이 아직 없음</w:t>
+            </w:r>
+          </w:p>
+        </w:tc>
+        <w:tc>
+          <w:tcPr>
+            <w:tcW w:type="dxa" w:w="2358"/>
+            <w:vAlign w:val="center"/>
+            <w:tcBorders>
+              <w:top w:val="single" w:sz="2" w:color="E3E3E3"/>
+              <w:bottom w:val="single" w:sz="2" w:color="E3E3E3"/>
+            </w:tcBorders>
+          </w:tcPr>
+          <w:p>
+            <w:pPr>
+              <w:spacing w:after="40"/>
+            </w:pPr>
+            <w:r>
+              <w:rPr>
+                <w:rFonts w:ascii="Pretendard" w:hAnsi="Pretendard" w:eastAsia="Pretendard"/>
+                <w:b w:val="0"/>
+                <w:color w:val="242424"/>
+                <w:sz w:val="17"/>
+              </w:rPr>
+              <w:t>권한 허용 후 창을 새로 열고 10초 시험</w:t>
+            </w:r>
+          </w:p>
+        </w:tc>
+      </w:tr>
+      <w:tr>
+        <w:tc>
+          <w:tcPr>
+            <w:tcW w:type="dxa" w:w="2358"/>
+            <w:vAlign w:val="center"/>
+            <w:shd w:fill="F5F5F5"/>
+            <w:tcBorders>
+              <w:top w:val="single" w:sz="2" w:color="E3E3E3"/>
+              <w:bottom w:val="single" w:sz="2" w:color="E3E3E3"/>
+            </w:tcBorders>
+          </w:tcPr>
+          <w:p>
+            <w:pPr>
+              <w:spacing w:after="40"/>
+            </w:pPr>
+            <w:r>
+              <w:rPr>
+                <w:rFonts w:ascii="Pretendard" w:hAnsi="Pretendard" w:eastAsia="Pretendard"/>
+                <w:b w:val="0"/>
+                <w:color w:val="242424"/>
+                <w:sz w:val="17"/>
+              </w:rPr>
+              <w:t>내 목소리만 들리고 상대방 소리가 없음</w:t>
+            </w:r>
+          </w:p>
+        </w:tc>
+        <w:tc>
+          <w:tcPr>
+            <w:tcW w:type="dxa" w:w="2358"/>
+            <w:vAlign w:val="center"/>
+            <w:shd w:fill="F5F5F5"/>
+            <w:tcBorders>
+              <w:top w:val="single" w:sz="2" w:color="E3E3E3"/>
+              <w:bottom w:val="single" w:sz="2" w:color="E3E3E3"/>
+            </w:tcBorders>
+          </w:tcPr>
+          <w:p>
+            <w:pPr>
+              <w:spacing w:after="40"/>
+            </w:pPr>
+            <w:r>
+              <w:rPr>
+                <w:rFonts w:ascii="Pretendard" w:hAnsi="Pretendard" w:eastAsia="Pretendard"/>
+                <w:b w:val="0"/>
+                <w:color w:val="242424"/>
+                <w:sz w:val="17"/>
+              </w:rPr>
+              <w:t>`화면 오디오 함께 녹음` 선택 여부와 화면 공유 창의 오디오 공유</w:t>
+            </w:r>
+          </w:p>
+        </w:tc>
+        <w:tc>
+          <w:tcPr>
+            <w:tcW w:type="dxa" w:w="2358"/>
+            <w:vAlign w:val="center"/>
+            <w:shd w:fill="F5F5F5"/>
+            <w:tcBorders>
+              <w:top w:val="single" w:sz="2" w:color="E3E3E3"/>
+              <w:bottom w:val="single" w:sz="2" w:color="E3E3E3"/>
+            </w:tcBorders>
+          </w:tcPr>
+          <w:p>
+            <w:pPr>
+              <w:spacing w:after="40"/>
+            </w:pPr>
+            <w:r>
+              <w:rPr>
+                <w:rFonts w:ascii="Pretendard" w:hAnsi="Pretendard" w:eastAsia="Pretendard"/>
+                <w:b w:val="0"/>
+                <w:color w:val="242424"/>
+                <w:sz w:val="17"/>
+              </w:rPr>
+              <w:t>마이크 원본은 남을 수 있음</w:t>
+            </w:r>
+          </w:p>
+        </w:tc>
+        <w:tc>
+          <w:tcPr>
+            <w:tcW w:type="dxa" w:w="2358"/>
+            <w:vAlign w:val="center"/>
+            <w:shd w:fill="F5F5F5"/>
+            <w:tcBorders>
+              <w:top w:val="single" w:sz="2" w:color="E3E3E3"/>
+              <w:bottom w:val="single" w:sz="2" w:color="E3E3E3"/>
+            </w:tcBorders>
+          </w:tcPr>
+          <w:p>
+            <w:pPr>
+              <w:spacing w:after="40"/>
+            </w:pPr>
+            <w:r>
+              <w:rPr>
+                <w:rFonts w:ascii="Pretendard" w:hAnsi="Pretendard" w:eastAsia="Pretendard"/>
+                <w:b w:val="0"/>
+                <w:color w:val="242424"/>
+                <w:sz w:val="17"/>
+              </w:rPr>
+              <w:t>헤드폰을 쓰는 화상회의는 시스템 오디오를 켜고 재시험</w:t>
+            </w:r>
+          </w:p>
+        </w:tc>
+      </w:tr>
+      <w:tr>
+        <w:tc>
+          <w:tcPr>
+            <w:tcW w:type="dxa" w:w="2358"/>
+            <w:vAlign w:val="center"/>
+            <w:tcBorders>
+              <w:top w:val="single" w:sz="2" w:color="E3E3E3"/>
+              <w:bottom w:val="single" w:sz="2" w:color="E3E3E3"/>
+            </w:tcBorders>
+          </w:tcPr>
+          <w:p>
+            <w:pPr>
+              <w:spacing w:after="40"/>
+            </w:pPr>
+            <w:r>
+              <w:rPr>
+                <w:rFonts w:ascii="Pretendard" w:hAnsi="Pretendard" w:eastAsia="Pretendard"/>
+                <w:b w:val="0"/>
+                <w:color w:val="242424"/>
+                <w:sz w:val="17"/>
+              </w:rPr>
+              <w:t>카메라가 검거나 사용 중으로 표시</w:t>
+            </w:r>
+          </w:p>
+        </w:tc>
+        <w:tc>
+          <w:tcPr>
+            <w:tcW w:type="dxa" w:w="2358"/>
+            <w:vAlign w:val="center"/>
+            <w:tcBorders>
+              <w:top w:val="single" w:sz="2" w:color="E3E3E3"/>
+              <w:bottom w:val="single" w:sz="2" w:color="E3E3E3"/>
+            </w:tcBorders>
+          </w:tcPr>
+          <w:p>
+            <w:pPr>
+              <w:spacing w:after="40"/>
+            </w:pPr>
+            <w:r>
+              <w:rPr>
+                <w:rFonts w:ascii="Pretendard" w:hAnsi="Pretendard" w:eastAsia="Pretendard"/>
+                <w:b w:val="0"/>
+                <w:color w:val="242424"/>
+                <w:sz w:val="17"/>
+              </w:rPr>
+              <w:t>Zoom·Teams·브라우저 등 다른 카메라 사용 앱</w:t>
+            </w:r>
+          </w:p>
+        </w:tc>
+        <w:tc>
+          <w:tcPr>
+            <w:tcW w:type="dxa" w:w="2358"/>
+            <w:vAlign w:val="center"/>
+            <w:tcBorders>
+              <w:top w:val="single" w:sz="2" w:color="E3E3E3"/>
+              <w:bottom w:val="single" w:sz="2" w:color="E3E3E3"/>
+            </w:tcBorders>
+          </w:tcPr>
+          <w:p>
+            <w:pPr>
+              <w:spacing w:after="40"/>
+            </w:pPr>
+            <w:r>
+              <w:rPr>
+                <w:rFonts w:ascii="Pretendard" w:hAnsi="Pretendard" w:eastAsia="Pretendard"/>
+                <w:b w:val="0"/>
+                <w:color w:val="242424"/>
+                <w:sz w:val="17"/>
+              </w:rPr>
+              <w:t>음성 녹음은 별도로 가능</w:t>
+            </w:r>
+          </w:p>
+        </w:tc>
+        <w:tc>
+          <w:tcPr>
+            <w:tcW w:type="dxa" w:w="2358"/>
+            <w:vAlign w:val="center"/>
+            <w:tcBorders>
+              <w:top w:val="single" w:sz="2" w:color="E3E3E3"/>
+              <w:bottom w:val="single" w:sz="2" w:color="E3E3E3"/>
+            </w:tcBorders>
+          </w:tcPr>
+          <w:p>
+            <w:pPr>
+              <w:spacing w:after="40"/>
+            </w:pPr>
+            <w:r>
+              <w:rPr>
+                <w:rFonts w:ascii="Pretendard" w:hAnsi="Pretendard" w:eastAsia="Pretendard"/>
+                <w:b w:val="0"/>
+                <w:color w:val="242424"/>
+                <w:sz w:val="17"/>
+              </w:rPr>
+              <w:t>다른 앱을 종료하고 카메라를 다시 연결</w:t>
+            </w:r>
+          </w:p>
+        </w:tc>
+      </w:tr>
+      <w:tr>
+        <w:tc>
+          <w:tcPr>
+            <w:tcW w:type="dxa" w:w="2358"/>
+            <w:vAlign w:val="center"/>
+            <w:shd w:fill="F5F5F5"/>
+            <w:tcBorders>
+              <w:top w:val="single" w:sz="2" w:color="E3E3E3"/>
+              <w:bottom w:val="single" w:sz="2" w:color="E3E3E3"/>
+            </w:tcBorders>
+          </w:tcPr>
+          <w:p>
+            <w:pPr>
+              <w:spacing w:after="40"/>
+            </w:pPr>
+            <w:r>
+              <w:rPr>
+                <w:rFonts w:ascii="Pretendard" w:hAnsi="Pretendard" w:eastAsia="Pretendard"/>
+                <w:b w:val="0"/>
+                <w:color w:val="242424"/>
+                <w:sz w:val="17"/>
+              </w:rPr>
+              <w:t>정지 후 결과가 바로 안 보임</w:t>
+            </w:r>
+          </w:p>
+        </w:tc>
+        <w:tc>
+          <w:tcPr>
+            <w:tcW w:type="dxa" w:w="2358"/>
+            <w:vAlign w:val="center"/>
+            <w:shd w:fill="F5F5F5"/>
+            <w:tcBorders>
+              <w:top w:val="single" w:sz="2" w:color="E3E3E3"/>
+              <w:bottom w:val="single" w:sz="2" w:color="E3E3E3"/>
+            </w:tcBorders>
+          </w:tcPr>
+          <w:p>
+            <w:pPr>
+              <w:spacing w:after="40"/>
+            </w:pPr>
+            <w:r>
+              <w:rPr>
+                <w:rFonts w:ascii="Pretendard" w:hAnsi="Pretendard" w:eastAsia="Pretendard"/>
+                <w:b w:val="0"/>
+                <w:color w:val="242424"/>
+                <w:sz w:val="17"/>
+              </w:rPr>
+              <w:t>오른쪽 아래 `작업함`의 진행률·오류</w:t>
+            </w:r>
+          </w:p>
+        </w:tc>
+        <w:tc>
+          <w:tcPr>
+            <w:tcW w:type="dxa" w:w="2358"/>
+            <w:vAlign w:val="center"/>
+            <w:shd w:fill="F5F5F5"/>
+            <w:tcBorders>
+              <w:top w:val="single" w:sz="2" w:color="E3E3E3"/>
+              <w:bottom w:val="single" w:sz="2" w:color="E3E3E3"/>
+            </w:tcBorders>
+          </w:tcPr>
+          <w:p>
+            <w:pPr>
+              <w:spacing w:after="40"/>
+            </w:pPr>
+            <w:r>
+              <w:rPr>
+                <w:rFonts w:ascii="Pretendard" w:hAnsi="Pretendard" w:eastAsia="Pretendard"/>
+                <w:b w:val="0"/>
+                <w:color w:val="242424"/>
+                <w:sz w:val="17"/>
+              </w:rPr>
+              <w:t>원본은 라이브러리에 먼저 저장됨</w:t>
+            </w:r>
+          </w:p>
+        </w:tc>
+        <w:tc>
+          <w:tcPr>
+            <w:tcW w:type="dxa" w:w="2358"/>
+            <w:vAlign w:val="center"/>
+            <w:shd w:fill="F5F5F5"/>
+            <w:tcBorders>
+              <w:top w:val="single" w:sz="2" w:color="E3E3E3"/>
+              <w:bottom w:val="single" w:sz="2" w:color="E3E3E3"/>
+            </w:tcBorders>
+          </w:tcPr>
+          <w:p>
+            <w:pPr>
+              <w:spacing w:after="40"/>
+            </w:pPr>
+            <w:r>
+              <w:rPr>
+                <w:rFonts w:ascii="Pretendard" w:hAnsi="Pretendard" w:eastAsia="Pretendard"/>
+                <w:b w:val="0"/>
+                <w:color w:val="242424"/>
+                <w:sz w:val="17"/>
+              </w:rPr>
+              <w:t>창을 닫지 말고 작업함과 라이브러리 확인</w:t>
+            </w:r>
+          </w:p>
+        </w:tc>
+      </w:tr>
+      <w:tr>
+        <w:tc>
+          <w:tcPr>
+            <w:tcW w:type="dxa" w:w="2358"/>
+            <w:vAlign w:val="center"/>
+            <w:tcBorders>
+              <w:top w:val="single" w:sz="2" w:color="E3E3E3"/>
+              <w:bottom w:val="single" w:sz="2" w:color="E3E3E3"/>
+            </w:tcBorders>
+          </w:tcPr>
+          <w:p>
+            <w:pPr>
+              <w:spacing w:after="40"/>
+            </w:pPr>
+            <w:r>
+              <w:rPr>
+                <w:rFonts w:ascii="Pretendard" w:hAnsi="Pretendard" w:eastAsia="Pretendard"/>
+                <w:b w:val="0"/>
+                <w:color w:val="242424"/>
+                <w:sz w:val="17"/>
+              </w:rPr>
+              <w:t>앱·브라우저가 중간에 종료됨</w:t>
+            </w:r>
+          </w:p>
+        </w:tc>
+        <w:tc>
+          <w:tcPr>
+            <w:tcW w:type="dxa" w:w="2358"/>
+            <w:vAlign w:val="center"/>
+            <w:tcBorders>
+              <w:top w:val="single" w:sz="2" w:color="E3E3E3"/>
+              <w:bottom w:val="single" w:sz="2" w:color="E3E3E3"/>
+            </w:tcBorders>
+          </w:tcPr>
+          <w:p>
+            <w:pPr>
+              <w:spacing w:after="40"/>
+            </w:pPr>
+            <w:r>
+              <w:rPr>
+                <w:rFonts w:ascii="Pretendard" w:hAnsi="Pretendard" w:eastAsia="Pretendard"/>
+                <w:b w:val="0"/>
+                <w:color w:val="242424"/>
+                <w:sz w:val="17"/>
+              </w:rPr>
+              <w:t>재실행 후 복구 안내·라이브러리</w:t>
+            </w:r>
+          </w:p>
+        </w:tc>
+        <w:tc>
+          <w:tcPr>
+            <w:tcW w:type="dxa" w:w="2358"/>
+            <w:vAlign w:val="center"/>
+            <w:tcBorders>
+              <w:top w:val="single" w:sz="2" w:color="E3E3E3"/>
+              <w:bottom w:val="single" w:sz="2" w:color="E3E3E3"/>
+            </w:tcBorders>
+          </w:tcPr>
+          <w:p>
+            <w:pPr>
+              <w:spacing w:after="40"/>
+            </w:pPr>
+            <w:r>
+              <w:rPr>
+                <w:rFonts w:ascii="Pretendard" w:hAnsi="Pretendard" w:eastAsia="Pretendard"/>
+                <w:b w:val="0"/>
+                <w:color w:val="242424"/>
+                <w:sz w:val="17"/>
+              </w:rPr>
+              <w:t>약 1분 단위 임시본이 있을 수 있음</w:t>
+            </w:r>
+          </w:p>
+        </w:tc>
+        <w:tc>
+          <w:tcPr>
+            <w:tcW w:type="dxa" w:w="2358"/>
+            <w:vAlign w:val="center"/>
+            <w:tcBorders>
+              <w:top w:val="single" w:sz="2" w:color="E3E3E3"/>
+              <w:bottom w:val="single" w:sz="2" w:color="E3E3E3"/>
+            </w:tcBorders>
+          </w:tcPr>
+          <w:p>
+            <w:pPr>
+              <w:spacing w:after="40"/>
+            </w:pPr>
+            <w:r>
+              <w:rPr>
+                <w:rFonts w:ascii="Pretendard" w:hAnsi="Pretendard" w:eastAsia="Pretendard"/>
+                <w:b w:val="0"/>
+                <w:color w:val="242424"/>
+                <w:sz w:val="17"/>
+              </w:rPr>
+              <w:t>복구 항목을 열고 원본 재생 후 처리 재개</w:t>
+            </w:r>
+          </w:p>
+        </w:tc>
+      </w:tr>
+      <w:tr>
+        <w:tc>
+          <w:tcPr>
+            <w:tcW w:type="dxa" w:w="2358"/>
+            <w:vAlign w:val="center"/>
+            <w:shd w:fill="F5F5F5"/>
+            <w:tcBorders>
+              <w:top w:val="single" w:sz="2" w:color="E3E3E3"/>
+              <w:bottom w:val="single" w:sz="2" w:color="E3E3E3"/>
+            </w:tcBorders>
+          </w:tcPr>
+          <w:p>
+            <w:pPr>
+              <w:spacing w:after="40"/>
+            </w:pPr>
+            <w:r>
+              <w:rPr>
+                <w:rFonts w:ascii="Pretendard" w:hAnsi="Pretendard" w:eastAsia="Pretendard"/>
+                <w:b w:val="0"/>
+                <w:color w:val="242424"/>
+                <w:sz w:val="17"/>
+              </w:rPr>
+              <w:t>저장 공간 부족</w:t>
+            </w:r>
+          </w:p>
+        </w:tc>
+        <w:tc>
+          <w:tcPr>
+            <w:tcW w:type="dxa" w:w="2358"/>
+            <w:vAlign w:val="center"/>
+            <w:shd w:fill="F5F5F5"/>
+            <w:tcBorders>
+              <w:top w:val="single" w:sz="2" w:color="E3E3E3"/>
+              <w:bottom w:val="single" w:sz="2" w:color="E3E3E3"/>
+            </w:tcBorders>
+          </w:tcPr>
+          <w:p>
+            <w:pPr>
+              <w:spacing w:after="40"/>
+            </w:pPr>
+            <w:r>
+              <w:rPr>
+                <w:rFonts w:ascii="Pretendard" w:hAnsi="Pretendard" w:eastAsia="Pretendard"/>
+                <w:b w:val="0"/>
+                <w:color w:val="242424"/>
+                <w:sz w:val="17"/>
+              </w:rPr>
+              <w:t>시스템 드라이브 여유 공간</w:t>
+            </w:r>
+          </w:p>
+        </w:tc>
+        <w:tc>
+          <w:tcPr>
+            <w:tcW w:type="dxa" w:w="2358"/>
+            <w:vAlign w:val="center"/>
+            <w:shd w:fill="F5F5F5"/>
+            <w:tcBorders>
+              <w:top w:val="single" w:sz="2" w:color="E3E3E3"/>
+              <w:bottom w:val="single" w:sz="2" w:color="E3E3E3"/>
+            </w:tcBorders>
+          </w:tcPr>
+          <w:p>
+            <w:pPr>
+              <w:spacing w:after="40"/>
+            </w:pPr>
+            <w:r>
+              <w:rPr>
+                <w:rFonts w:ascii="Pretendard" w:hAnsi="Pretendard" w:eastAsia="Pretendard"/>
+                <w:b w:val="0"/>
+                <w:color w:val="242424"/>
+                <w:sz w:val="17"/>
+              </w:rPr>
+              <w:t>시작 전 차단되거나 긴급 복구 파일이 내려올 수 있음</w:t>
+            </w:r>
+          </w:p>
+        </w:tc>
+        <w:tc>
+          <w:tcPr>
+            <w:tcW w:type="dxa" w:w="2358"/>
+            <w:vAlign w:val="center"/>
+            <w:shd w:fill="F5F5F5"/>
+            <w:tcBorders>
+              <w:top w:val="single" w:sz="2" w:color="E3E3E3"/>
+              <w:bottom w:val="single" w:sz="2" w:color="E3E3E3"/>
+            </w:tcBorders>
+          </w:tcPr>
+          <w:p>
+            <w:pPr>
+              <w:spacing w:after="40"/>
+            </w:pPr>
+            <w:r>
+              <w:rPr>
+                <w:rFonts w:ascii="Pretendard" w:hAnsi="Pretendard" w:eastAsia="Pretendard"/>
+                <w:b w:val="0"/>
+                <w:color w:val="242424"/>
+                <w:sz w:val="17"/>
+              </w:rPr>
+              <w:t>최소 5GB를 비우고 다운로드 목록 확인</w:t>
+            </w:r>
+          </w:p>
+        </w:tc>
+      </w:tr>
+      <w:tr>
+        <w:tc>
+          <w:tcPr>
+            <w:tcW w:type="dxa" w:w="2358"/>
+            <w:vAlign w:val="center"/>
+            <w:tcBorders>
+              <w:top w:val="single" w:sz="2" w:color="E3E3E3"/>
+              <w:bottom w:val="single" w:sz="2" w:color="E3E3E3"/>
+            </w:tcBorders>
+          </w:tcPr>
+          <w:p>
+            <w:pPr>
+              <w:spacing w:after="40"/>
+            </w:pPr>
+            <w:r>
+              <w:rPr>
+                <w:rFonts w:ascii="Pretendard" w:hAnsi="Pretendard" w:eastAsia="Pretendard"/>
+                <w:b w:val="0"/>
+                <w:color w:val="242424"/>
+                <w:sz w:val="17"/>
+              </w:rPr>
+              <w:t>AI 회의록만 실패</w:t>
+            </w:r>
+          </w:p>
+        </w:tc>
+        <w:tc>
+          <w:tcPr>
+            <w:tcW w:type="dxa" w:w="2358"/>
+            <w:vAlign w:val="center"/>
+            <w:tcBorders>
+              <w:top w:val="single" w:sz="2" w:color="E3E3E3"/>
+              <w:bottom w:val="single" w:sz="2" w:color="E3E3E3"/>
+            </w:tcBorders>
+          </w:tcPr>
+          <w:p>
+            <w:pPr>
+              <w:spacing w:after="40"/>
+            </w:pPr>
+            <w:r>
+              <w:rPr>
+                <w:rFonts w:ascii="Pretendard" w:hAnsi="Pretendard" w:eastAsia="Pretendard"/>
+                <w:b w:val="0"/>
+                <w:color w:val="242424"/>
+                <w:sz w:val="17"/>
+              </w:rPr>
+              <w:t>인터넷·AI 제공자 연결·사용량</w:t>
+            </w:r>
+          </w:p>
+        </w:tc>
+        <w:tc>
+          <w:tcPr>
+            <w:tcW w:type="dxa" w:w="2358"/>
+            <w:vAlign w:val="center"/>
+            <w:tcBorders>
+              <w:top w:val="single" w:sz="2" w:color="E3E3E3"/>
+              <w:bottom w:val="single" w:sz="2" w:color="E3E3E3"/>
+            </w:tcBorders>
+          </w:tcPr>
+          <w:p>
+            <w:pPr>
+              <w:spacing w:after="40"/>
+            </w:pPr>
+            <w:r>
+              <w:rPr>
+                <w:rFonts w:ascii="Pretendard" w:hAnsi="Pretendard" w:eastAsia="Pretendard"/>
+                <w:b w:val="0"/>
+                <w:color w:val="242424"/>
+                <w:sz w:val="17"/>
+              </w:rPr>
+              <w:t>녹음·받아쓰기에는 영향 없음</w:t>
+            </w:r>
+          </w:p>
+        </w:tc>
+        <w:tc>
+          <w:tcPr>
+            <w:tcW w:type="dxa" w:w="2358"/>
+            <w:vAlign w:val="center"/>
+            <w:tcBorders>
+              <w:top w:val="single" w:sz="2" w:color="E3E3E3"/>
+              <w:bottom w:val="single" w:sz="2" w:color="E3E3E3"/>
+            </w:tcBorders>
+          </w:tcPr>
+          <w:p>
+            <w:pPr>
+              <w:spacing w:after="40"/>
+            </w:pPr>
+            <w:r>
+              <w:rPr>
+                <w:rFonts w:ascii="Pretendard" w:hAnsi="Pretendard" w:eastAsia="Pretendard"/>
+                <w:b w:val="0"/>
+                <w:color w:val="242424"/>
+                <w:sz w:val="17"/>
+              </w:rPr>
+              <w:t>작업함에서 실패 이유 확인 후 재시도</w:t>
+            </w:r>
+          </w:p>
+        </w:tc>
+      </w:tr>
+      <w:tr>
+        <w:tc>
+          <w:tcPr>
+            <w:tcW w:type="dxa" w:w="2358"/>
+            <w:vAlign w:val="center"/>
+            <w:shd w:fill="F5F5F5"/>
+            <w:tcBorders>
+              <w:top w:val="single" w:sz="2" w:color="E3E3E3"/>
+              <w:bottom w:val="single" w:sz="8" w:color="111111"/>
+            </w:tcBorders>
+          </w:tcPr>
+          <w:p>
+            <w:pPr>
+              <w:spacing w:after="40"/>
+            </w:pPr>
+            <w:r>
+              <w:rPr>
+                <w:rFonts w:ascii="Pretendard" w:hAnsi="Pretendard" w:eastAsia="Pretendard"/>
+                <w:b w:val="0"/>
+                <w:color w:val="242424"/>
+                <w:sz w:val="17"/>
+              </w:rPr>
+              <w:t>업데이트 후 옛 화면이 열림</w:t>
+            </w:r>
+          </w:p>
+        </w:tc>
+        <w:tc>
+          <w:tcPr>
+            <w:tcW w:type="dxa" w:w="2358"/>
+            <w:vAlign w:val="center"/>
+            <w:shd w:fill="F5F5F5"/>
+            <w:tcBorders>
+              <w:top w:val="single" w:sz="2" w:color="E3E3E3"/>
+              <w:bottom w:val="single" w:sz="8" w:color="111111"/>
+            </w:tcBorders>
+          </w:tcPr>
+          <w:p>
+            <w:pPr>
+              <w:spacing w:after="40"/>
+            </w:pPr>
+            <w:r>
+              <w:rPr>
+                <w:rFonts w:ascii="Pretendard" w:hAnsi="Pretendard" w:eastAsia="Pretendard"/>
+                <w:b w:val="0"/>
+                <w:color w:val="242424"/>
+                <w:sz w:val="17"/>
+              </w:rPr>
+              <w:t>앱을 완전히 종료했는지와 설정의 버전</w:t>
+            </w:r>
+          </w:p>
+        </w:tc>
+        <w:tc>
+          <w:tcPr>
+            <w:tcW w:type="dxa" w:w="2358"/>
+            <w:vAlign w:val="center"/>
+            <w:shd w:fill="F5F5F5"/>
+            <w:tcBorders>
+              <w:top w:val="single" w:sz="2" w:color="E3E3E3"/>
+              <w:bottom w:val="single" w:sz="8" w:color="111111"/>
+            </w:tcBorders>
+          </w:tcPr>
+          <w:p>
+            <w:pPr>
+              <w:spacing w:after="40"/>
+            </w:pPr>
+            <w:r>
+              <w:rPr>
+                <w:rFonts w:ascii="Pretendard" w:hAnsi="Pretendard" w:eastAsia="Pretendard"/>
+                <w:b w:val="0"/>
+                <w:color w:val="242424"/>
+                <w:sz w:val="17"/>
+              </w:rPr>
+              <w:t>데이터는 삭제하지 않음</w:t>
+            </w:r>
+          </w:p>
+        </w:tc>
+        <w:tc>
+          <w:tcPr>
+            <w:tcW w:type="dxa" w:w="2358"/>
+            <w:vAlign w:val="center"/>
+            <w:shd w:fill="F5F5F5"/>
+            <w:tcBorders>
+              <w:top w:val="single" w:sz="2" w:color="E3E3E3"/>
+              <w:bottom w:val="single" w:sz="8" w:color="111111"/>
+            </w:tcBorders>
+          </w:tcPr>
+          <w:p>
+            <w:pPr>
+              <w:spacing w:after="40"/>
+            </w:pPr>
+            <w:r>
+              <w:rPr>
+                <w:rFonts w:ascii="Pretendard" w:hAnsi="Pretendard" w:eastAsia="Pretendard"/>
+                <w:b w:val="0"/>
+                <w:color w:val="242424"/>
+                <w:sz w:val="17"/>
+              </w:rPr>
+              <w:t>아래 업데이트 절차로 기존 서버 종료 후 새 버전 실행</w:t>
+            </w:r>
+          </w:p>
+        </w:tc>
+      </w:tr>
+    </w:tbl>
+    <w:p>
+      <w:pPr>
+        <w:spacing w:after="0"/>
+      </w:pPr>
     </w:p>
     <w:p>
       <w:pPr>
@@ -3248,6 +4323,228 @@
     <w:p>
       <w:pPr>
         <w:keepNext/>
+        <w:spacing w:before="160" w:after="80"/>
+      </w:pPr>
+      <w:r>
+        <w:rPr>
+          <w:rFonts w:ascii="Pretendard" w:hAnsi="Pretendard" w:eastAsia="Pretendard"/>
+          <w:b/>
+          <w:color w:val="111111"/>
+          <w:sz w:val="23"/>
+        </w:rPr>
+        <w:t>Windows 권한을 다시 켜는 방법</w:t>
+      </w:r>
+    </w:p>
+    <w:p>
+      <w:pPr>
+        <w:spacing w:after="60" w:line="300" w:lineRule="auto"/>
+        <w:ind w:left="288" w:hanging="288"/>
+      </w:pPr>
+      <w:r>
+        <w:rPr>
+          <w:rFonts w:ascii="Pretendard" w:hAnsi="Pretendard" w:eastAsia="Pretendard"/>
+          <w:b/>
+          <w:color w:val="111111"/>
+          <w:sz w:val="19"/>
+        </w:rPr>
+        <w:t xml:space="preserve">1. </w:t>
+      </w:r>
+      <w:r>
+        <w:rPr>
+          <w:rFonts w:ascii="Pretendard" w:hAnsi="Pretendard" w:eastAsia="Pretendard"/>
+          <w:b w:val="0"/>
+          <w:color w:val="242424"/>
+          <w:sz w:val="19"/>
+        </w:rPr>
+        <w:t>`설정 → 개인정보 및 보안 → 마이크`에서 데스크톱 앱 접근을 켭니다.</w:t>
+      </w:r>
+    </w:p>
+    <w:p>
+      <w:pPr>
+        <w:spacing w:after="60" w:line="300" w:lineRule="auto"/>
+        <w:ind w:left="288" w:hanging="288"/>
+      </w:pPr>
+      <w:r>
+        <w:rPr>
+          <w:rFonts w:ascii="Pretendard" w:hAnsi="Pretendard" w:eastAsia="Pretendard"/>
+          <w:b/>
+          <w:color w:val="111111"/>
+          <w:sz w:val="19"/>
+        </w:rPr>
+        <w:t xml:space="preserve">2. </w:t>
+      </w:r>
+      <w:r>
+        <w:rPr>
+          <w:rFonts w:ascii="Pretendard" w:hAnsi="Pretendard" w:eastAsia="Pretendard"/>
+          <w:b w:val="0"/>
+          <w:color w:val="242424"/>
+          <w:sz w:val="19"/>
+        </w:rPr>
+        <w:t>영상 회의라면 같은 위치의 `카메라` 접근도 켭니다.</w:t>
+      </w:r>
+    </w:p>
+    <w:p>
+      <w:pPr>
+        <w:spacing w:after="60" w:line="300" w:lineRule="auto"/>
+        <w:ind w:left="288" w:hanging="288"/>
+      </w:pPr>
+      <w:r>
+        <w:rPr>
+          <w:rFonts w:ascii="Pretendard" w:hAnsi="Pretendard" w:eastAsia="Pretendard"/>
+          <w:b/>
+          <w:color w:val="111111"/>
+          <w:sz w:val="19"/>
+        </w:rPr>
+        <w:t xml:space="preserve">3. </w:t>
+      </w:r>
+      <w:r>
+        <w:rPr>
+          <w:rFonts w:ascii="Pretendard" w:hAnsi="Pretendard" w:eastAsia="Pretendard"/>
+          <w:b w:val="0"/>
+          <w:color w:val="242424"/>
+          <w:sz w:val="19"/>
+        </w:rPr>
+        <w:t>Chrome 또는 Edge 주소창 왼쪽의 사이트 설정에서 마이크·카메라를 `허용`으로 바꿉니다.</w:t>
+      </w:r>
+    </w:p>
+    <w:p>
+      <w:pPr>
+        <w:spacing w:after="60" w:line="300" w:lineRule="auto"/>
+        <w:ind w:left="288" w:hanging="288"/>
+      </w:pPr>
+      <w:r>
+        <w:rPr>
+          <w:rFonts w:ascii="Pretendard" w:hAnsi="Pretendard" w:eastAsia="Pretendard"/>
+          <w:b/>
+          <w:color w:val="111111"/>
+          <w:sz w:val="19"/>
+        </w:rPr>
+        <w:t xml:space="preserve">4. </w:t>
+      </w:r>
+      <w:r>
+        <w:rPr>
+          <w:rFonts w:ascii="Pretendard" w:hAnsi="Pretendard" w:eastAsia="Pretendard"/>
+          <w:b w:val="0"/>
+          <w:color w:val="242424"/>
+          <w:sz w:val="19"/>
+        </w:rPr>
+        <w:t>AI PRONOTE 창을 모두 닫고 다시 시작한 뒤 10초 시험 녹음을 합니다.</w:t>
+      </w:r>
+    </w:p>
+    <w:p>
+      <w:pPr>
+        <w:keepNext/>
+        <w:spacing w:before="160" w:after="80"/>
+      </w:pPr>
+      <w:r>
+        <w:rPr>
+          <w:rFonts w:ascii="Pretendard" w:hAnsi="Pretendard" w:eastAsia="Pretendard"/>
+          <w:b/>
+          <w:color w:val="111111"/>
+          <w:sz w:val="23"/>
+        </w:rPr>
+        <w:t>Mac 권한을 다시 켜는 방법</w:t>
+      </w:r>
+    </w:p>
+    <w:p>
+      <w:pPr>
+        <w:spacing w:after="60" w:line="300" w:lineRule="auto"/>
+        <w:ind w:left="288" w:hanging="288"/>
+      </w:pPr>
+      <w:r>
+        <w:rPr>
+          <w:rFonts w:ascii="Pretendard" w:hAnsi="Pretendard" w:eastAsia="Pretendard"/>
+          <w:b/>
+          <w:color w:val="111111"/>
+          <w:sz w:val="19"/>
+        </w:rPr>
+        <w:t xml:space="preserve">1. </w:t>
+      </w:r>
+      <w:r>
+        <w:rPr>
+          <w:rFonts w:ascii="Pretendard" w:hAnsi="Pretendard" w:eastAsia="Pretendard"/>
+          <w:b w:val="0"/>
+          <w:color w:val="242424"/>
+          <w:sz w:val="19"/>
+        </w:rPr>
+        <w:t>`시스템 설정 → 개인정보 보호 및 보안 → 마이크`에서 사용하는 브라우저를 켭니다.</w:t>
+      </w:r>
+    </w:p>
+    <w:p>
+      <w:pPr>
+        <w:spacing w:after="60" w:line="300" w:lineRule="auto"/>
+        <w:ind w:left="288" w:hanging="288"/>
+      </w:pPr>
+      <w:r>
+        <w:rPr>
+          <w:rFonts w:ascii="Pretendard" w:hAnsi="Pretendard" w:eastAsia="Pretendard"/>
+          <w:b/>
+          <w:color w:val="111111"/>
+          <w:sz w:val="19"/>
+        </w:rPr>
+        <w:t xml:space="preserve">2. </w:t>
+      </w:r>
+      <w:r>
+        <w:rPr>
+          <w:rFonts w:ascii="Pretendard" w:hAnsi="Pretendard" w:eastAsia="Pretendard"/>
+          <w:b w:val="0"/>
+          <w:color w:val="242424"/>
+          <w:sz w:val="19"/>
+        </w:rPr>
+        <w:t>영상 회의라면 `카메라`, 화상회의 상대방 소리라면 필요한 `화면 및 시스템 오디오 녹음` 권한도 확인합니다.</w:t>
+      </w:r>
+    </w:p>
+    <w:p>
+      <w:pPr>
+        <w:spacing w:after="60" w:line="300" w:lineRule="auto"/>
+        <w:ind w:left="288" w:hanging="288"/>
+      </w:pPr>
+      <w:r>
+        <w:rPr>
+          <w:rFonts w:ascii="Pretendard" w:hAnsi="Pretendard" w:eastAsia="Pretendard"/>
+          <w:b/>
+          <w:color w:val="111111"/>
+          <w:sz w:val="19"/>
+        </w:rPr>
+        <w:t xml:space="preserve">3. </w:t>
+      </w:r>
+      <w:r>
+        <w:rPr>
+          <w:rFonts w:ascii="Pretendard" w:hAnsi="Pretendard" w:eastAsia="Pretendard"/>
+          <w:b w:val="0"/>
+          <w:color w:val="242424"/>
+          <w:sz w:val="19"/>
+        </w:rPr>
+        <w:t>브라우저를 완전히 종료했다가 다시 열고 AI PRONOTE를 시작합니다.</w:t>
+      </w:r>
+    </w:p>
+    <w:p>
+      <w:pPr>
+        <w:spacing w:after="60" w:line="300" w:lineRule="auto"/>
+        <w:ind w:left="288" w:hanging="288"/>
+      </w:pPr>
+      <w:r>
+        <w:rPr>
+          <w:rFonts w:ascii="Pretendard" w:hAnsi="Pretendard" w:eastAsia="Pretendard"/>
+          <w:b/>
+          <w:color w:val="111111"/>
+          <w:sz w:val="19"/>
+        </w:rPr>
+        <w:t xml:space="preserve">4. </w:t>
+      </w:r>
+      <w:r>
+        <w:rPr>
+          <w:rFonts w:ascii="Pretendard" w:hAnsi="Pretendard" w:eastAsia="Pretendard"/>
+          <w:b w:val="0"/>
+          <w:color w:val="242424"/>
+          <w:sz w:val="19"/>
+        </w:rPr>
+        <w:t>권한을 바꾼 직후에는 실제 회의 전에 10초 시험 녹음을 합니다.</w:t>
+      </w:r>
+    </w:p>
+    <w:p>
+      <w:pPr>
+        <w:keepNext/>
         <w:spacing w:before="240" w:after="140"/>
         <w:pBdr>
           <w:bottom w:val="single" w:sz="6" w:color="E3E3E3" w:space="5"/>
@@ -3260,7 +4557,285 @@
           <w:color w:val="111111"/>
           <w:sz w:val="30"/>
         </w:rPr>
-        <w:t>11. 안전하게 사용하기</w:t>
+        <w:t>11. 버전 확인과 업데이트</w:t>
+      </w:r>
+    </w:p>
+    <w:p>
+      <w:pPr>
+        <w:keepNext/>
+        <w:spacing w:before="160" w:after="80"/>
+      </w:pPr>
+      <w:r>
+        <w:rPr>
+          <w:rFonts w:ascii="Pretendard" w:hAnsi="Pretendard" w:eastAsia="Pretendard"/>
+          <w:b/>
+          <w:color w:val="111111"/>
+          <w:sz w:val="23"/>
+        </w:rPr>
+        <w:t>현재 버전 확인</w:t>
+      </w:r>
+    </w:p>
+    <w:p>
+      <w:pPr>
+        <w:spacing w:after="60" w:line="300" w:lineRule="auto"/>
+        <w:ind w:left="288" w:hanging="288"/>
+      </w:pPr>
+      <w:r>
+        <w:rPr>
+          <w:rFonts w:ascii="Pretendard" w:hAnsi="Pretendard" w:eastAsia="Pretendard"/>
+          <w:b/>
+          <w:color w:val="111111"/>
+          <w:sz w:val="19"/>
+        </w:rPr>
+        <w:t xml:space="preserve">1. </w:t>
+      </w:r>
+      <w:r>
+        <w:rPr>
+          <w:rFonts w:ascii="Pretendard" w:hAnsi="Pretendard" w:eastAsia="Pretendard"/>
+          <w:b w:val="0"/>
+          <w:color w:val="242424"/>
+          <w:sz w:val="19"/>
+        </w:rPr>
+        <w:t>왼쪽 메뉴에서 `설정`을 엽니다.</w:t>
+      </w:r>
+    </w:p>
+    <w:p>
+      <w:pPr>
+        <w:spacing w:after="60" w:line="300" w:lineRule="auto"/>
+        <w:ind w:left="288" w:hanging="288"/>
+      </w:pPr>
+      <w:r>
+        <w:rPr>
+          <w:rFonts w:ascii="Pretendard" w:hAnsi="Pretendard" w:eastAsia="Pretendard"/>
+          <w:b/>
+          <w:color w:val="111111"/>
+          <w:sz w:val="19"/>
+        </w:rPr>
+        <w:t xml:space="preserve">2. </w:t>
+      </w:r>
+      <w:r>
+        <w:rPr>
+          <w:rFonts w:ascii="Pretendard" w:hAnsi="Pretendard" w:eastAsia="Pretendard"/>
+          <w:b w:val="0"/>
+          <w:color w:val="242424"/>
+          <w:sz w:val="19"/>
+        </w:rPr>
+        <w:t>진단 또는 버전 정보에서 앱 버전을 확인합니다.</w:t>
+      </w:r>
+    </w:p>
+    <w:p>
+      <w:pPr>
+        <w:spacing w:after="60" w:line="300" w:lineRule="auto"/>
+        <w:ind w:left="288" w:hanging="288"/>
+      </w:pPr>
+      <w:r>
+        <w:rPr>
+          <w:rFonts w:ascii="Pretendard" w:hAnsi="Pretendard" w:eastAsia="Pretendard"/>
+          <w:b/>
+          <w:color w:val="111111"/>
+          <w:sz w:val="19"/>
+        </w:rPr>
+        <w:t xml:space="preserve">3. </w:t>
+      </w:r>
+      <w:r>
+        <w:rPr>
+          <w:rFonts w:ascii="Pretendard" w:hAnsi="Pretendard" w:eastAsia="Pretendard"/>
+          <w:b w:val="0"/>
+          <w:color w:val="242424"/>
+          <w:sz w:val="19"/>
+        </w:rPr>
+        <w:t>Beta3의 내부 버전은 `v1.5.0-beta3.20260918`입니다.</w:t>
+      </w:r>
+    </w:p>
+    <w:p>
+      <w:pPr>
+        <w:keepNext/>
+        <w:spacing w:before="160" w:after="80"/>
+      </w:pPr>
+      <w:r>
+        <w:rPr>
+          <w:rFonts w:ascii="Pretendard" w:hAnsi="Pretendard" w:eastAsia="Pretendard"/>
+          <w:b/>
+          <w:color w:val="111111"/>
+          <w:sz w:val="23"/>
+        </w:rPr>
+        <w:t>새 버전으로 업데이트</w:t>
+      </w:r>
+    </w:p>
+    <w:p>
+      <w:pPr>
+        <w:spacing w:after="60" w:line="300" w:lineRule="auto"/>
+        <w:ind w:left="288" w:hanging="288"/>
+      </w:pPr>
+      <w:r>
+        <w:rPr>
+          <w:rFonts w:ascii="Pretendard" w:hAnsi="Pretendard" w:eastAsia="Pretendard"/>
+          <w:b/>
+          <w:color w:val="111111"/>
+          <w:sz w:val="19"/>
+        </w:rPr>
+        <w:t xml:space="preserve">1. </w:t>
+      </w:r>
+      <w:r>
+        <w:rPr>
+          <w:rFonts w:ascii="Pretendard" w:hAnsi="Pretendard" w:eastAsia="Pretendard"/>
+          <w:b w:val="0"/>
+          <w:color w:val="242424"/>
+          <w:sz w:val="19"/>
+        </w:rPr>
+        <w:t>진행 중인 녹음과 작업함 처리가 없는지 확인합니다.</w:t>
+      </w:r>
+    </w:p>
+    <w:p>
+      <w:pPr>
+        <w:spacing w:after="60" w:line="300" w:lineRule="auto"/>
+        <w:ind w:left="288" w:hanging="288"/>
+      </w:pPr>
+      <w:r>
+        <w:rPr>
+          <w:rFonts w:ascii="Pretendard" w:hAnsi="Pretendard" w:eastAsia="Pretendard"/>
+          <w:b/>
+          <w:color w:val="111111"/>
+          <w:sz w:val="19"/>
+        </w:rPr>
+        <w:t xml:space="preserve">2. </w:t>
+      </w:r>
+      <w:r>
+        <w:rPr>
+          <w:rFonts w:ascii="Pretendard" w:hAnsi="Pretendard" w:eastAsia="Pretendard"/>
+          <w:b w:val="0"/>
+          <w:color w:val="242424"/>
+          <w:sz w:val="19"/>
+        </w:rPr>
+        <w:t>라이브러리에서 중요한 원본과 결과가 다시 열리는지 확인합니다.</w:t>
+      </w:r>
+    </w:p>
+    <w:p>
+      <w:pPr>
+        <w:spacing w:after="60" w:line="300" w:lineRule="auto"/>
+        <w:ind w:left="288" w:hanging="288"/>
+      </w:pPr>
+      <w:r>
+        <w:rPr>
+          <w:rFonts w:ascii="Pretendard" w:hAnsi="Pretendard" w:eastAsia="Pretendard"/>
+          <w:b/>
+          <w:color w:val="111111"/>
+          <w:sz w:val="19"/>
+        </w:rPr>
+        <w:t xml:space="preserve">3. </w:t>
+      </w:r>
+      <w:r>
+        <w:rPr>
+          <w:rFonts w:ascii="Pretendard" w:hAnsi="Pretendard" w:eastAsia="Pretendard"/>
+          <w:b w:val="0"/>
+          <w:color w:val="242424"/>
+          <w:sz w:val="19"/>
+        </w:rPr>
+        <w:t>AI PRONOTE를 완전히 종료합니다. Mac은 `STOP_AI_PRONOTE.command`를 사용할 수 있습니다.</w:t>
+      </w:r>
+    </w:p>
+    <w:p>
+      <w:pPr>
+        <w:spacing w:after="60" w:line="300" w:lineRule="auto"/>
+        <w:ind w:left="288" w:hanging="288"/>
+      </w:pPr>
+      <w:r>
+        <w:rPr>
+          <w:rFonts w:ascii="Pretendard" w:hAnsi="Pretendard" w:eastAsia="Pretendard"/>
+          <w:b/>
+          <w:color w:val="111111"/>
+          <w:sz w:val="19"/>
+        </w:rPr>
+        <w:t xml:space="preserve">4. </w:t>
+      </w:r>
+      <w:r>
+        <w:rPr>
+          <w:rFonts w:ascii="Pretendard" w:hAnsi="Pretendard" w:eastAsia="Pretendard"/>
+          <w:b w:val="0"/>
+          <w:color w:val="242424"/>
+          <w:sz w:val="19"/>
+        </w:rPr>
+        <w:t>새 ZIP을 기존 폴더 위에 덮어쓰지 말고 새 폴더에 완전히 풉니다.</w:t>
+      </w:r>
+    </w:p>
+    <w:p>
+      <w:pPr>
+        <w:spacing w:after="60" w:line="300" w:lineRule="auto"/>
+        <w:ind w:left="288" w:hanging="288"/>
+      </w:pPr>
+      <w:r>
+        <w:rPr>
+          <w:rFonts w:ascii="Pretendard" w:hAnsi="Pretendard" w:eastAsia="Pretendard"/>
+          <w:b/>
+          <w:color w:val="111111"/>
+          <w:sz w:val="19"/>
+        </w:rPr>
+        <w:t xml:space="preserve">5. </w:t>
+      </w:r>
+      <w:r>
+        <w:rPr>
+          <w:rFonts w:ascii="Pretendard" w:hAnsi="Pretendard" w:eastAsia="Pretendard"/>
+          <w:b w:val="0"/>
+          <w:color w:val="242424"/>
+          <w:sz w:val="19"/>
+        </w:rPr>
+        <w:t>새 폴더의 첫 설정을 실행한 뒤 새 바로가기로 시작합니다.</w:t>
+      </w:r>
+    </w:p>
+    <w:p>
+      <w:pPr>
+        <w:spacing w:after="60" w:line="300" w:lineRule="auto"/>
+        <w:ind w:left="288" w:hanging="288"/>
+      </w:pPr>
+      <w:r>
+        <w:rPr>
+          <w:rFonts w:ascii="Pretendard" w:hAnsi="Pretendard" w:eastAsia="Pretendard"/>
+          <w:b/>
+          <w:color w:val="111111"/>
+          <w:sz w:val="19"/>
+        </w:rPr>
+        <w:t xml:space="preserve">6. </w:t>
+      </w:r>
+      <w:r>
+        <w:rPr>
+          <w:rFonts w:ascii="Pretendard" w:hAnsi="Pretendard" w:eastAsia="Pretendard"/>
+          <w:b w:val="0"/>
+          <w:color w:val="242424"/>
+          <w:sz w:val="19"/>
+        </w:rPr>
+        <w:t>표시된 버전과 10초 시험 녹음·재생을 확인합니다.</w:t>
+      </w:r>
+    </w:p>
+    <w:p>
+      <w:pPr>
+        <w:spacing w:after="100" w:line="324" w:lineRule="auto"/>
+      </w:pPr>
+      <w:r>
+        <w:rPr>
+          <w:rFonts w:ascii="Pretendard" w:hAnsi="Pretendard" w:eastAsia="Pretendard"/>
+          <w:b w:val="0"/>
+          <w:color w:val="242424"/>
+          <w:sz w:val="20"/>
+        </w:rPr>
+        <w:t>구버전이 이미 8795 포트를 사용 중이면 새 버전은 옛 화면을 대신 열지 않고 버전 충돌로 중단됩니다. 기존 AI PRONOTE를 종료한 뒤 새 설치본을 다시 실행하세요. data_v15 폴더를 임의로 합치거나 덮어쓰지 마세요.</w:t>
+      </w:r>
+    </w:p>
+    <w:p>
+      <w:pPr>
+        <w:keepNext/>
+        <w:spacing w:before="240" w:after="140"/>
+        <w:pBdr>
+          <w:bottom w:val="single" w:sz="6" w:color="E3E3E3" w:space="5"/>
+        </w:pBdr>
+      </w:pPr>
+      <w:r>
+        <w:rPr>
+          <w:rFonts w:ascii="Pretendard" w:hAnsi="Pretendard" w:eastAsia="Pretendard"/>
+          <w:b/>
+          <w:color w:val="111111"/>
+          <w:sz w:val="30"/>
+        </w:rPr>
+        <w:t>12. 안전하게 사용하기</w:t>
       </w:r>
     </w:p>
     <w:p>
@@ -3398,7 +4973,7 @@
           <w:color w:val="111111"/>
           <w:sz w:val="30"/>
         </w:rPr>
-        <w:t>12. 도움을 요청할 때</w:t>
+        <w:t>13. 도움을 요청할 때</w:t>
       </w:r>
     </w:p>
     <w:p>
@@ -3564,7 +5139,7 @@
           <w:color w:val="111111"/>
           <w:sz w:val="30"/>
         </w:rPr>
-        <w:t>13. 회의 전·중·후 확인표</w:t>
+        <w:t>14. 회의 전·중·후 확인표</w:t>
       </w:r>
     </w:p>
     <w:tbl>
@@ -4281,7 +5856,7 @@
           <w:color w:val="111111"/>
           <w:sz w:val="30"/>
         </w:rPr>
-        <w:t>14. 용어 안내</w:t>
+        <w:t>15. 용어 안내</w:t>
       </w:r>
     </w:p>
     <w:tbl>

</xml_diff>

<commit_message>
Release Beta4 with safe empty meeting state
</commit_message>
<xml_diff>
--- a/docs/AI_PRONOTE_v1.5_사용설명서.docx
+++ b/docs/AI_PRONOTE_v1.5_사용설명서.docx
@@ -2991,7 +2991,7 @@
           <w:color w:val="242424"/>
           <w:sz w:val="20"/>
         </w:rPr>
-        <w:t>현재 Beta3에서는 이어진 구간이 별도 기록으로 안전하게 저장됩니다. 두 구간이 자동으로 하나의 회의록에 합쳐지지는 않으므로, 최종 공유 전 두 결과를 모두 확인하세요.</w:t>
+        <w:t>현재 Beta4에서는 이어진 구간이 별도 기록으로 안전하게 저장됩니다. 두 구간이 자동으로 하나의 회의록에 합쳐지지는 않으므로, 최종 공유 전 두 결과를 모두 확인하세요.</w:t>
       </w:r>
     </w:p>
     <w:p>
@@ -4644,7 +4644,7 @@
           <w:color w:val="242424"/>
           <w:sz w:val="19"/>
         </w:rPr>
-        <w:t>Beta3의 내부 버전은 `v1.5.0-beta3.20260918`입니다.</w:t>
+        <w:t>Beta4의 내부 버전은 `v1.5.0-beta4.20260918`입니다.</w:t>
       </w:r>
     </w:p>
     <w:p>

</xml_diff>

<commit_message>
Release Beta5 note editor and export workflow
</commit_message>
<xml_diff>
--- a/docs/AI_PRONOTE_v1.5_사용설명서.docx
+++ b/docs/AI_PRONOTE_v1.5_사용설명서.docx
@@ -2038,7 +2038,7 @@
           <w:color w:val="242424"/>
           <w:sz w:val="19"/>
         </w:rPr>
-        <w:t>회의 제목을 입력합니다.</w:t>
+        <w:t>큰 노트 편집기에서 제목을 입력합니다.</w:t>
       </w:r>
     </w:p>
     <w:p>
@@ -2086,7 +2086,7 @@
           <w:color w:val="242424"/>
           <w:sz w:val="19"/>
         </w:rPr>
-        <w:t>다른 회의를 열기 전에 저장 상태를 확인합니다.</w:t>
+        <w:t>사진은 `이미지 첨부`로 넣습니다. 사진은 저장공간 보호를 위해 자동으로 줄어듭니다.</w:t>
       </w:r>
     </w:p>
     <w:p>
@@ -2110,7 +2110,79 @@
           <w:color w:val="242424"/>
           <w:sz w:val="19"/>
         </w:rPr>
-        <w:t>앱을 닫았다 다시 열고 라이브러리에서 작성한 노트를 확인합니다.</w:t>
+        <w:t>제목 아래의 `저장됨` 상태를 확인합니다. 입력을 멈추면 자동 저장됩니다.</w:t>
+      </w:r>
+    </w:p>
+    <w:p>
+      <w:pPr>
+        <w:spacing w:after="60" w:line="300" w:lineRule="auto"/>
+        <w:ind w:left="288" w:hanging="288"/>
+      </w:pPr>
+      <w:r>
+        <w:rPr>
+          <w:rFonts w:ascii="Pretendard" w:hAnsi="Pretendard" w:eastAsia="Pretendard"/>
+          <w:b/>
+          <w:color w:val="111111"/>
+          <w:sz w:val="19"/>
+        </w:rPr>
+        <w:t xml:space="preserve">6. </w:t>
+      </w:r>
+      <w:r>
+        <w:rPr>
+          <w:rFonts w:ascii="Pretendard" w:hAnsi="Pretendard" w:eastAsia="Pretendard"/>
+          <w:b w:val="0"/>
+          <w:color w:val="242424"/>
+          <w:sz w:val="19"/>
+        </w:rPr>
+        <w:t>`다른 노트`에서 저장된 노트를 검색하고 다시 엽니다.</w:t>
+      </w:r>
+    </w:p>
+    <w:p>
+      <w:pPr>
+        <w:spacing w:after="60" w:line="300" w:lineRule="auto"/>
+        <w:ind w:left="288" w:hanging="288"/>
+      </w:pPr>
+      <w:r>
+        <w:rPr>
+          <w:rFonts w:ascii="Pretendard" w:hAnsi="Pretendard" w:eastAsia="Pretendard"/>
+          <w:b/>
+          <w:color w:val="111111"/>
+          <w:sz w:val="19"/>
+        </w:rPr>
+        <w:t xml:space="preserve">7. </w:t>
+      </w:r>
+      <w:r>
+        <w:rPr>
+          <w:rFonts w:ascii="Pretendard" w:hAnsi="Pretendard" w:eastAsia="Pretendard"/>
+          <w:b w:val="0"/>
+          <w:color w:val="242424"/>
+          <w:sz w:val="19"/>
+        </w:rPr>
+        <w:t>`내보내기`에서 TXT, Markdown, HTML, 노트 백업(JSON)을 선택하거나 `인쇄 · PDF 저장`을 사용합니다.</w:t>
+      </w:r>
+    </w:p>
+    <w:p>
+      <w:pPr>
+        <w:spacing w:after="60" w:line="300" w:lineRule="auto"/>
+        <w:ind w:left="288" w:hanging="288"/>
+      </w:pPr>
+      <w:r>
+        <w:rPr>
+          <w:rFonts w:ascii="Pretendard" w:hAnsi="Pretendard" w:eastAsia="Pretendard"/>
+          <w:b/>
+          <w:color w:val="111111"/>
+          <w:sz w:val="19"/>
+        </w:rPr>
+        <w:t xml:space="preserve">8. </w:t>
+      </w:r>
+      <w:r>
+        <w:rPr>
+          <w:rFonts w:ascii="Pretendard" w:hAnsi="Pretendard" w:eastAsia="Pretendard"/>
+          <w:b w:val="0"/>
+          <w:color w:val="242424"/>
+          <w:sz w:val="19"/>
+        </w:rPr>
+        <w:t>`보내기`는 기기 공유 메뉴를 열며, 지원하지 않는 기기에서는 복사 후 원하는 앱에 붙여넣을 수 있습니다.</w:t>
       </w:r>
     </w:p>
     <w:p>
@@ -2124,7 +2196,7 @@
           <w:color w:val="242424"/>
           <w:sz w:val="20"/>
         </w:rPr>
-        <w:t>필기만 시작하면 마이크·카메라 녹음이나 AI 전송이 자동으로 시작되지 않습니다. 노트 A를 작성한 뒤 노트 B로 이동할 때 제목과 내용이 서로 섞이지 않는지 확인하세요.</w:t>
+        <w:t>필기만 시작하면 마이크·카메라 녹음이나 AI 전송이 자동으로 시작되지 않습니다. 내 노트는 회의록 자동 발송·공유에서 제외되지만, 사용자가 내보내기나 보내기를 직접 선택하면 외부 파일 또는 다른 앱으로 전달됩니다.</w:t>
       </w:r>
     </w:p>
     <w:p>
@@ -4644,7 +4716,7 @@
           <w:color w:val="242424"/>
           <w:sz w:val="19"/>
         </w:rPr>
-        <w:t>Beta4의 내부 버전은 `v1.5.0-beta4.20260918`입니다.</w:t>
+        <w:t>Beta5의 내부 버전은 `v1.5.0-beta5.20260918`입니다.</w:t>
       </w:r>
     </w:p>
     <w:p>

</xml_diff>

<commit_message>
Release Beta6 continuation recording and note recovery
</commit_message>
<xml_diff>
--- a/docs/AI_PRONOTE_v1.5_사용설명서.docx
+++ b/docs/AI_PRONOTE_v1.5_사용설명서.docx
@@ -610,7 +610,7 @@
           <w:color w:val="242424"/>
           <w:sz w:val="19"/>
         </w:rPr>
-        <w:t>압축을 푼 폴더에서 `1_INSTALL_AI_PRONOTE.ps1`을 실행합니다.</w:t>
+        <w:t>압축을 푼 폴더에서 `1_FIRST_SETUP.cmd`를 실행합니다.</w:t>
       </w:r>
     </w:p>
     <w:p>
@@ -721,7 +721,7 @@
           <w:color w:val="242424"/>
           <w:sz w:val="19"/>
         </w:rPr>
-        <w:t>폴더 안의 `1_INSTALL.command`를 엽니다.</w:t>
+        <w:t>폴더 안의 `mac/1_FIRST_SETUP.command`를 엽니다.</w:t>
       </w:r>
     </w:p>
     <w:p>
@@ -2158,7 +2158,7 @@
           <w:color w:val="242424"/>
           <w:sz w:val="19"/>
         </w:rPr>
-        <w:t>`내보내기`에서 TXT, Markdown, HTML, 노트 백업(JSON)을 선택하거나 `인쇄 · PDF 저장`을 사용합니다.</w:t>
+        <w:t>`내보내기`에서 TXT, Markdown, HTML, 노트 백업(JSON), PNG 텍스트 스냅샷을 선택하거나 `인쇄 · PDF 저장`을 사용합니다.</w:t>
       </w:r>
     </w:p>
     <w:p>
@@ -3001,7 +3001,7 @@
           <w:color w:val="242424"/>
           <w:sz w:val="19"/>
         </w:rPr>
-        <w:t>이전 회의 제목 뒤에 `· 이어서`가 붙었는지 확인합니다.</w:t>
+        <w:t>같은 회의 제목이 유지되는지 확인합니다.</w:t>
       </w:r>
     </w:p>
     <w:p>
@@ -3054,6 +3054,30 @@
     </w:p>
     <w:p>
       <w:pPr>
+        <w:spacing w:after="60" w:line="300" w:lineRule="auto"/>
+        <w:ind w:left="288" w:hanging="288"/>
+      </w:pPr>
+      <w:r>
+        <w:rPr>
+          <w:rFonts w:ascii="Pretendard" w:hAnsi="Pretendard" w:eastAsia="Pretendard"/>
+          <w:b/>
+          <w:color w:val="111111"/>
+          <w:sz w:val="19"/>
+        </w:rPr>
+        <w:t xml:space="preserve">5. </w:t>
+      </w:r>
+      <w:r>
+        <w:rPr>
+          <w:rFonts w:ascii="Pretendard" w:hAnsi="Pretendard" w:eastAsia="Pretendard"/>
+          <w:b w:val="0"/>
+          <w:color w:val="242424"/>
+          <w:sz w:val="19"/>
+        </w:rPr>
+        <w:t>결과의 녹음 구간 선택기에서 각 구간을 재생하고, 합쳐진 받아쓰기와 회의록을 확인합니다.</w:t>
+      </w:r>
+    </w:p>
+    <w:p>
+      <w:pPr>
         <w:spacing w:after="100" w:line="324" w:lineRule="auto"/>
       </w:pPr>
       <w:r>
@@ -3063,7 +3087,7 @@
           <w:color w:val="242424"/>
           <w:sz w:val="20"/>
         </w:rPr>
-        <w:t>현재 Beta4에서는 이어진 구간이 별도 기록으로 안전하게 저장됩니다. 두 구간이 자동으로 하나의 회의록에 합쳐지지는 않으므로, 최종 공유 전 두 결과를 모두 확인하세요.</w:t>
+        <w:t>이어 녹음은 새 회의를 만들지 않고 같은 회의에 녹음 구간을 추가합니다. 각 구간의 원본은 따로 보존되며, 받아쓰기와 회의록은 구간별 제목과 함께 한 회의 결과에 모입니다.</w:t>
       </w:r>
     </w:p>
     <w:p>
@@ -4716,7 +4740,7 @@
           <w:color w:val="242424"/>
           <w:sz w:val="19"/>
         </w:rPr>
-        <w:t>Beta5의 내부 버전은 `v1.5.0-beta5.20260918`입니다.</w:t>
+        <w:t>Beta6의 내부 버전은 `v1.5.0-beta6.20260918`입니다.</w:t>
       </w:r>
     </w:p>
     <w:p>

</xml_diff>

<commit_message>
Release Beta7 note recovery and long-run validation
</commit_message>
<xml_diff>
--- a/docs/AI_PRONOTE_v1.5_사용설명서.docx
+++ b/docs/AI_PRONOTE_v1.5_사용설명서.docx
@@ -2197,6 +2197,20 @@
           <w:sz w:val="20"/>
         </w:rPr>
         <w:t>필기만 시작하면 마이크·카메라 녹음이나 AI 전송이 자동으로 시작되지 않습니다. 내 노트는 회의록 자동 발송·공유에서 제외되지만, 사용자가 내보내기나 보내기를 직접 선택하면 외부 파일 또는 다른 앱으로 전달됩니다.</w:t>
+      </w:r>
+    </w:p>
+    <w:p>
+      <w:pPr>
+        <w:spacing w:after="100" w:line="324" w:lineRule="auto"/>
+      </w:pPr>
+      <w:r>
+        <w:rPr>
+          <w:rFonts w:ascii="Pretendard" w:hAnsi="Pretendard" w:eastAsia="Pretendard"/>
+          <w:b w:val="0"/>
+          <w:color w:val="242424"/>
+          <w:sz w:val="20"/>
+        </w:rPr>
+        <w:t>저장 공간 또는 브라우저 저장소 문제로 저장 실패 · 복구본 필요가 표시되면 화면을 닫지 마세요. 안내 영역의 긴급 복구본 다운로드를 눌러 JSON 파일을 보관한 뒤 저장 공간을 확보하세요. 나중에 노트 백업 가져오기로 그 파일을 새 노트로 복구할 수 있습니다.</w:t>
       </w:r>
     </w:p>
     <w:p>
@@ -4740,7 +4754,7 @@
           <w:color w:val="242424"/>
           <w:sz w:val="19"/>
         </w:rPr>
-        <w:t>Beta6의 내부 버전은 `v1.5.0-beta6.20260918`입니다.</w:t>
+        <w:t>Beta7의 내부 버전은 `v1.5.0-beta7.20260918`입니다.</w:t>
       </w:r>
     </w:p>
     <w:p>

</xml_diff>

<commit_message>
release: add Beta8 note archive backup
</commit_message>
<xml_diff>
--- a/docs/AI_PRONOTE_v1.5_사용설명서.docx
+++ b/docs/AI_PRONOTE_v1.5_사용설명서.docx
@@ -2182,6 +2182,54 @@
           <w:color w:val="242424"/>
           <w:sz w:val="19"/>
         </w:rPr>
+        <w:t>저장된 노트를 한꺼번에 보관하려면 `전체 백업`을 누릅니다. 키보드 노트와 펜 필기가 ZIP 파일 하나에 함께 저장됩니다.</w:t>
+      </w:r>
+    </w:p>
+    <w:p>
+      <w:pPr>
+        <w:spacing w:after="60" w:line="300" w:lineRule="auto"/>
+        <w:ind w:left="288" w:hanging="288"/>
+      </w:pPr>
+      <w:r>
+        <w:rPr>
+          <w:rFonts w:ascii="Pretendard" w:hAnsi="Pretendard" w:eastAsia="Pretendard"/>
+          <w:b/>
+          <w:color w:val="111111"/>
+          <w:sz w:val="19"/>
+        </w:rPr>
+        <w:t xml:space="preserve">9. </w:t>
+      </w:r>
+      <w:r>
+        <w:rPr>
+          <w:rFonts w:ascii="Pretendard" w:hAnsi="Pretendard" w:eastAsia="Pretendard"/>
+          <w:b w:val="0"/>
+          <w:color w:val="242424"/>
+          <w:sz w:val="19"/>
+        </w:rPr>
+        <w:t>ZIP 전체 백업이나 개별 JSON 백업을 되살리려면 `백업 불러오기`를 누릅니다. 기존 노트는 덮어쓰지 않고 새 노트로 추가됩니다.</w:t>
+      </w:r>
+    </w:p>
+    <w:p>
+      <w:pPr>
+        <w:spacing w:after="60" w:line="300" w:lineRule="auto"/>
+        <w:ind w:left="288" w:hanging="288"/>
+      </w:pPr>
+      <w:r>
+        <w:rPr>
+          <w:rFonts w:ascii="Pretendard" w:hAnsi="Pretendard" w:eastAsia="Pretendard"/>
+          <w:b/>
+          <w:color w:val="111111"/>
+          <w:sz w:val="19"/>
+        </w:rPr>
+        <w:t xml:space="preserve">10. </w:t>
+      </w:r>
+      <w:r>
+        <w:rPr>
+          <w:rFonts w:ascii="Pretendard" w:hAnsi="Pretendard" w:eastAsia="Pretendard"/>
+          <w:b w:val="0"/>
+          <w:color w:val="242424"/>
+          <w:sz w:val="19"/>
+        </w:rPr>
         <w:t>`보내기`는 기기 공유 메뉴를 열며, 지원하지 않는 기기에서는 복사 후 원하는 앱에 붙여넣을 수 있습니다.</w:t>
       </w:r>
     </w:p>
@@ -2211,6 +2259,20 @@
           <w:sz w:val="20"/>
         </w:rPr>
         <w:t>저장 공간 또는 브라우저 저장소 문제로 저장 실패 · 복구본 필요가 표시되면 화면을 닫지 마세요. 안내 영역의 긴급 복구본 다운로드를 눌러 JSON 파일을 보관한 뒤 저장 공간을 확보하세요. 나중에 노트 백업 가져오기로 그 파일을 새 노트로 복구할 수 있습니다.</w:t>
+      </w:r>
+    </w:p>
+    <w:p>
+      <w:pPr>
+        <w:spacing w:after="100" w:line="324" w:lineRule="auto"/>
+      </w:pPr>
+      <w:r>
+        <w:rPr>
+          <w:rFonts w:ascii="Pretendard" w:hAnsi="Pretendard" w:eastAsia="Pretendard"/>
+          <w:b w:val="0"/>
+          <w:color w:val="242424"/>
+          <w:sz w:val="20"/>
+        </w:rPr>
+        <w:t>전체 백업은 한 번에 499개, 16MB까지 지원합니다. 백업이 끝나면 다운로드 폴더의 ZIP 파일을 외장 저장장치나 클라우드처럼 앱과 다른 위치에도 복사해 두세요. 복구 후에는 노트 제목과 본문뿐 아니라 펜 필기도 열어 확인하세요.</w:t>
       </w:r>
     </w:p>
     <w:p>
@@ -4754,7 +4816,7 @@
           <w:color w:val="242424"/>
           <w:sz w:val="19"/>
         </w:rPr>
-        <w:t>Beta7의 내부 버전은 `v1.5.0-beta7.20260918`입니다.</w:t>
+        <w:t>Beta8의 내부 버전은 `v1.5.0-beta8.20260918`입니다.</w:t>
       </w:r>
     </w:p>
     <w:p>

</xml_diff>